<commit_message>
docs: 移交文档 Word 与 PDF 按最新 HANDOVER 重导
Co-Authored-By: Claude Fable 5.1 <noreply@anthropic.com>
</commit_message>
<xml_diff>
--- a/docs/proposal/幼师学坊-移交文档.docx
+++ b/docs/proposal/幼师学坊-移交文档.docx
@@ -2081,6 +2081,33 @@
                 <w:rStyle w:val="VerbatimChar"/>
               </w:rPr>
               <w:t xml:space="preserve">docs/WALLET-TODO.md</w:t>
+            </w:r>
+            <w:r>
+              <w:t xml:space="preserve">；给工坊同学的整理版</w:t>
+            </w:r>
+            <w:r>
+              <w:t xml:space="preserve"> </w:t>
+            </w:r>
+            <w:r>
+              <w:rPr>
+                <w:rStyle w:val="VerbatimChar"/>
+              </w:rPr>
+              <w:t xml:space="preserve">workshop-share/教研工坊-钱包接口增量.md</w:t>
+            </w:r>
+            <w:r>
+              <w:t xml:space="preserve"> </w:t>
+            </w:r>
+            <w:r>
+              <w:t xml:space="preserve">与</w:t>
+            </w:r>
+            <w:r>
+              <w:t xml:space="preserve"> </w:t>
+            </w:r>
+            <w:r>
+              <w:rPr>
+                <w:rStyle w:val="VerbatimChar"/>
+              </w:rPr>
+              <w:t xml:space="preserve">wallet-openapi.yaml</w:t>
             </w:r>
           </w:p>
         </w:tc>

</xml_diff>